<commit_message>
docs: update backend url and add frontend loading note
</commit_message>
<xml_diff>
--- a/docs/07_Running_the_Project.docx
+++ b/docs/07_Running_the_Project.docx
@@ -86,12 +86,6 @@
         <w:gridCol w:w="4873"/>
       </w:tblGrid>
       <w:tr>
-        <w:tblPrEx>
-          <w:tblCellMar>
-            <w:top w:w="0" w:type="dxa"/>
-            <w:bottom w:w="0" w:type="dxa"/>
-          </w:tblCellMar>
-        </w:tblPrEx>
         <w:tc>
           <w:tcPr>
             <w:tcW w:w="4873" w:type="dxa"/>
@@ -1036,12 +1030,6 @@
               <w:gridCol w:w="9746"/>
             </w:tblGrid>
             <w:tr>
-              <w:tblPrEx>
-                <w:tblCellMar>
-                  <w:top w:w="0" w:type="dxa"/>
-                  <w:bottom w:w="0" w:type="dxa"/>
-                </w:tblCellMar>
-              </w:tblPrEx>
               <w:tc>
                 <w:tcPr>
                   <w:tcW w:w="9746" w:type="dxa"/>
@@ -1350,12 +1338,6 @@
         <w:gridCol w:w="9746"/>
       </w:tblGrid>
       <w:tr>
-        <w:tblPrEx>
-          <w:tblCellMar>
-            <w:top w:w="0" w:type="dxa"/>
-            <w:bottom w:w="0" w:type="dxa"/>
-          </w:tblCellMar>
-        </w:tblPrEx>
         <w:tc>
           <w:tcPr>
             <w:tcW w:w="9746" w:type="dxa"/>
@@ -1758,12 +1740,6 @@
               <w:gridCol w:w="9746"/>
             </w:tblGrid>
             <w:tr>
-              <w:tblPrEx>
-                <w:tblCellMar>
-                  <w:top w:w="0" w:type="dxa"/>
-                  <w:bottom w:w="0" w:type="dxa"/>
-                </w:tblCellMar>
-              </w:tblPrEx>
               <w:tc>
                 <w:tcPr>
                   <w:tcW w:w="9746" w:type="dxa"/>
@@ -2721,6 +2697,9 @@
               <w:spacing w:after="80"/>
             </w:pPr>
             <w:r>
+              <w:rPr>
+                <w:noProof/>
+              </w:rPr>
               <w:drawing>
                 <wp:inline distT="0" distB="0" distL="0" distR="0" wp14:anchorId="170538A4" wp14:editId="3E5AB95B">
                   <wp:extent cx="6188710" cy="746760"/>
@@ -2814,12 +2793,6 @@
               <w:gridCol w:w="9746"/>
             </w:tblGrid>
             <w:tr>
-              <w:tblPrEx>
-                <w:tblCellMar>
-                  <w:top w:w="0" w:type="dxa"/>
-                  <w:bottom w:w="0" w:type="dxa"/>
-                </w:tblCellMar>
-              </w:tblPrEx>
               <w:tc>
                 <w:tcPr>
                   <w:tcW w:w="9746" w:type="dxa"/>
@@ -2916,12 +2889,6 @@
         <w:gridCol w:w="9746"/>
       </w:tblGrid>
       <w:tr>
-        <w:tblPrEx>
-          <w:tblCellMar>
-            <w:top w:w="0" w:type="dxa"/>
-            <w:bottom w:w="0" w:type="dxa"/>
-          </w:tblCellMar>
-        </w:tblPrEx>
         <w:tc>
           <w:tcPr>
             <w:tcW w:w="9746" w:type="dxa"/>
@@ -3428,12 +3395,6 @@
               <w:gridCol w:w="9746"/>
             </w:tblGrid>
             <w:tr>
-              <w:tblPrEx>
-                <w:tblCellMar>
-                  <w:top w:w="0" w:type="dxa"/>
-                  <w:bottom w:w="0" w:type="dxa"/>
-                </w:tblCellMar>
-              </w:tblPrEx>
               <w:tc>
                 <w:tcPr>
                   <w:tcW w:w="9746" w:type="dxa"/>
@@ -3909,17 +3870,11 @@
         <w:tblLook w:val="04A0" w:firstRow="1" w:lastRow="0" w:firstColumn="1" w:lastColumn="0" w:noHBand="0" w:noVBand="1"/>
       </w:tblPr>
       <w:tblGrid>
-        <w:gridCol w:w="2800"/>
-        <w:gridCol w:w="3000"/>
-        <w:gridCol w:w="3946"/>
+        <w:gridCol w:w="2632"/>
+        <w:gridCol w:w="3481"/>
+        <w:gridCol w:w="3633"/>
       </w:tblGrid>
       <w:tr>
-        <w:tblPrEx>
-          <w:tblCellMar>
-            <w:top w:w="0" w:type="dxa"/>
-            <w:bottom w:w="0" w:type="dxa"/>
-          </w:tblCellMar>
-        </w:tblPrEx>
         <w:tc>
           <w:tcPr>
             <w:tcW w:w="2800" w:type="dxa"/>
@@ -4012,12 +3967,6 @@
         </w:tc>
       </w:tr>
       <w:tr>
-        <w:tblPrEx>
-          <w:tblCellMar>
-            <w:top w:w="0" w:type="dxa"/>
-            <w:bottom w:w="0" w:type="dxa"/>
-          </w:tblCellMar>
-        </w:tblPrEx>
         <w:tc>
           <w:tcPr>
             <w:tcW w:w="2800" w:type="dxa"/>
@@ -4123,12 +4072,6 @@
         </w:tc>
       </w:tr>
       <w:tr>
-        <w:tblPrEx>
-          <w:tblCellMar>
-            <w:top w:w="0" w:type="dxa"/>
-            <w:bottom w:w="0" w:type="dxa"/>
-          </w:tblCellMar>
-        </w:tblPrEx>
         <w:tc>
           <w:tcPr>
             <w:tcW w:w="2800" w:type="dxa"/>
@@ -4192,6 +4135,15 @@
                 <w:szCs w:val="18"/>
               </w:rPr>
               <w:t>http://127.0.0.1:8000</w:t>
+            </w:r>
+            <w:r>
+              <w:rPr>
+                <w:rFonts w:ascii="Courier New" w:eastAsia="Courier New" w:hAnsi="Courier New" w:cs="Courier New"/>
+                <w:color w:val="CDD6F4"/>
+                <w:sz w:val="18"/>
+                <w:szCs w:val="18"/>
+              </w:rPr>
+              <w:t>/api/docs</w:t>
             </w:r>
           </w:p>
         </w:tc>
@@ -4251,12 +4203,6 @@
         <w:gridCol w:w="9746"/>
       </w:tblGrid>
       <w:tr>
-        <w:tblPrEx>
-          <w:tblCellMar>
-            <w:top w:w="0" w:type="dxa"/>
-            <w:bottom w:w="0" w:type="dxa"/>
-          </w:tblCellMar>
-        </w:tblPrEx>
         <w:tc>
           <w:tcPr>
             <w:tcW w:w="9746" w:type="dxa"/>
@@ -4275,18 +4221,7 @@
             </w:tcMar>
           </w:tcPr>
           <w:p>
-            <w:proofErr w:type="gramStart"/>
-            <w:r>
-              <w:rPr>
-                <w:b/>
-                <w:bCs/>
-                <w:color w:val="1E7A4A"/>
-                <w:sz w:val="20"/>
-                <w:szCs w:val="20"/>
-              </w:rPr>
-              <w:t xml:space="preserve">TIP  </w:t>
-            </w:r>
-            <w:r>
+            <w:pPr>
               <w:rPr>
                 <w:i/>
                 <w:iCs/>
@@ -4294,9 +4229,17 @@
                 <w:sz w:val="20"/>
                 <w:szCs w:val="20"/>
               </w:rPr>
-              <w:t>Open</w:t>
-            </w:r>
-            <w:proofErr w:type="gramEnd"/>
+            </w:pPr>
+            <w:r>
+              <w:rPr>
+                <w:b/>
+                <w:bCs/>
+                <w:color w:val="1E7A4A"/>
+                <w:sz w:val="20"/>
+                <w:szCs w:val="20"/>
+              </w:rPr>
+              <w:t xml:space="preserve">TIP </w:t>
+            </w:r>
             <w:r>
               <w:rPr>
                 <w:i/>
@@ -4305,7 +4248,7 @@
                 <w:sz w:val="20"/>
                 <w:szCs w:val="20"/>
               </w:rPr>
-              <w:t xml:space="preserve"> http://localhost:</w:t>
+              <w:t>Open http://localhost:</w:t>
             </w:r>
             <w:r>
               <w:rPr>
@@ -4328,6 +4271,29 @@
               <w:t xml:space="preserve"> in your browser to access the frontend. The frontend communicates with the backend at http://127.0.0.1:8000 automatically.</w:t>
             </w:r>
           </w:p>
+          <w:p>
+            <w:pPr>
+              <w:rPr>
+                <w:i/>
+                <w:iCs/>
+                <w:color w:val="1E7A4A"/>
+                <w:sz w:val="20"/>
+                <w:szCs w:val="20"/>
+              </w:rPr>
+            </w:pPr>
+          </w:p>
+          <w:p>
+            <w:r>
+              <w:rPr>
+                <w:i/>
+                <w:iCs/>
+                <w:color w:val="1E7A4A"/>
+                <w:sz w:val="20"/>
+                <w:szCs w:val="20"/>
+              </w:rPr>
+              <w:t xml:space="preserve">The frontend may take a minute or so to load for the first initial load. </w:t>
+            </w:r>
+          </w:p>
         </w:tc>
       </w:tr>
     </w:tbl>
@@ -4537,7 +4503,6 @@
         <w:pStyle w:val="Heading2"/>
       </w:pPr>
       <w:r>
-        <w:lastRenderedPageBreak/>
         <w:t>Stopping the Servers</w:t>
       </w:r>
     </w:p>

</xml_diff>